<commit_message>
Rework July plan: English framing, French captions only (per user preference)
All structure/instructions in English with an EN gloss under each French
caption; only the publishable content stays in French.
</commit_message>
<xml_diff>
--- a/content-plan/Juillet-2026-Plan-Les-Paillettes-Vertes.docx
+++ b/content-plan/Juillet-2026-Plan-Les-Paillettes-Vertes.docx
@@ -7,7 +7,7 @@
         <w:pStyle w:val="Title"/>
       </w:pPr>
       <w:r>
-        <w:t>Plan de contenu — JUILLET 2026</w:t>
+        <w:t>Content Plan — JULY 2026</w:t>
       </w:r>
     </w:p>
     <w:p>
@@ -17,7 +17,15 @@
           <w:color w:val="4E7A51"/>
           <w:sz w:val="26"/>
         </w:rPr>
-        <w:t>Les Paillettes Vertes · Thème du mois : « Voyagez léger, vivez durable » (L'été, version solide)</w:t>
+        <w:t>Les Paillettes Vertes · Monthly theme: "Travel light, live sustainably" (Summer, the solid way)</w:t>
+      </w:r>
+    </w:p>
+    <w:p>
+      <w:pPr>
+        <w:pStyle w:val="IntenseQuote"/>
+      </w:pPr>
+      <w:r>
+        <w:t>Format note: everything is in English except the **French captions / on-image text** that you actually publish (kept in French for your Suisse romande audience). Each French block has an *(EN: …)* line telling you what it says.</w:t>
       </w:r>
     </w:p>
     <w:p>
@@ -33,30 +41,30 @@
         <w:pStyle w:val="Heading1"/>
       </w:pPr>
       <w:r>
-        <w:t>☀️ Positionnement du mois</w:t>
+        <w:t>☀️ Monthly positioning</w:t>
       </w:r>
     </w:p>
     <w:p>
       <w:r>
-        <w:t xml:space="preserve">Juillet = vacances, voyages, camping, lac, randonnée. C'est LE moment où le zéro déchet devient </w:t>
+        <w:t xml:space="preserve">July = holidays, travel, camping, lakes, hiking. It's the moment zero-waste becomes </w:t>
       </w:r>
       <w:r>
         <w:rPr>
           <w:b/>
         </w:rPr>
-        <w:t>évident et pratique</w:t>
+        <w:t>obvious and practical</w:t>
       </w:r>
       <w:r>
-        <w:t xml:space="preserve"> : les produits solides sont plus légers à emporter, ne coulent pas dans la valise… et </w:t>
+        <w:t xml:space="preserve">: solid products are lighter to pack, don't leak in your bag… and </w:t>
       </w:r>
       <w:r>
         <w:rPr>
           <w:b/>
         </w:rPr>
-        <w:t>passent sans problème en cabine d'avion</w:t>
+        <w:t>sail through airport security</w:t>
       </w:r>
       <w:r>
-        <w:t>.</w:t>
+        <w:t xml:space="preserve"> (no 100 ml liquid limit).</w:t>
       </w:r>
     </w:p>
     <w:p>
@@ -65,7 +73,7 @@
         <w:rPr>
           <w:b/>
         </w:rPr>
-        <w:t>Le grand argument du mois (à marteler) :</w:t>
+        <w:t>The key selling argument this month (hammer it everywhere):</w:t>
       </w:r>
       <w:r/>
     </w:p>
@@ -74,7 +82,7 @@
         <w:pStyle w:val="IntenseQuote"/>
       </w:pPr>
       <w:r>
-        <w:t>✈️ **Fini le casse-tête des liquides à l'aéroport !** Shampoings et savons solides ne sont pas soumis à la limite des 100 ml. Pas de fuite, pas de sachet plastique, pas de stress au contrôle de sécurité.</w:t>
+        <w:t>✈️ Solid shampoos &amp; soaps are NOT liquids — no 100 ml rule, no leaks, no plastic baggie, no stress at security.</w:t>
       </w:r>
     </w:p>
     <w:p>
@@ -83,10 +91,10 @@
         <w:rPr>
           <w:b/>
         </w:rPr>
-        <w:t>Double sens du slogan « voyagez léger » :</w:t>
+        <w:t>Double meaning of "travel light":</w:t>
       </w:r>
       <w:r>
-        <w:t xml:space="preserve"> littéralement plus léger à transporter + on garde ses bonnes habitudes écolo en vacances.</w:t>
+        <w:t xml:space="preserve"> literally lighter to carry + you keep your eco habits on holiday.</w:t>
       </w:r>
     </w:p>
     <w:p>
@@ -102,7 +110,7 @@
         <w:pStyle w:val="Heading1"/>
       </w:pPr>
       <w:r>
-        <w:t>🎁 Offres du mois</w:t>
+        <w:t>🎁 Offers of the month</w:t>
       </w:r>
     </w:p>
     <w:p>
@@ -113,7 +121,7 @@
         <w:rPr>
           <w:b/>
         </w:rPr>
-        <w:t>OFFRE PHARE — Kit Voyage</w:t>
+        <w:t>HERO OFFER — "Kit Voyage" (Travel Kit)</w:t>
       </w:r>
       <w:r>
         <w:t xml:space="preserve"> 🧳</w:t>
@@ -121,25 +129,25 @@
     </w:p>
     <w:p>
       <w:r>
-        <w:t xml:space="preserve">   Shampoing solide + savon + déodorant naturel, vendus en set à </w:t>
+        <w:t xml:space="preserve">   Solid shampoo + soap + natural deodorant, sold as a set at </w:t>
       </w:r>
       <w:r>
         <w:rPr>
           <w:b/>
         </w:rPr>
-        <w:t>−15 % à −20 %</w:t>
+        <w:t>−15% to −20%</w:t>
       </w:r>
       <w:r>
-        <w:t xml:space="preserve"> (à confirmer). Option : </w:t>
+        <w:t xml:space="preserve"> (to confirm). Option: </w:t>
       </w:r>
       <w:r>
         <w:rPr>
           <w:b/>
         </w:rPr>
-        <w:t>pochette/boîte de voyage offerte</w:t>
+        <w:t>free travel pouch/tin</w:t>
       </w:r>
       <w:r>
-        <w:t xml:space="preserve"> dès CHF X d'achat.</w:t>
+        <w:t xml:space="preserve"> above CHF X.</w:t>
       </w:r>
     </w:p>
     <w:p>
@@ -150,15 +158,78 @@
         <w:rPr>
           <w:b/>
         </w:rPr>
-        <w:t>FLASH mi-juillet — 1 = 2 sur les shampoings solides</w:t>
+        <w:t>MID-MONTH FLASH — 1 = 2 on solid shampoos</w:t>
       </w:r>
       <w:r>
-        <w:t xml:space="preserve"> (72 h, ~15–17 juil.) : le 2e offert. Mécanique forte sur le produit de voyage n°1.</w:t>
+        <w:t xml:space="preserve"> (72h, ~15–17 July): second one free. Strong mechanic on the #1 travel product.</w:t>
+      </w:r>
+    </w:p>
+    <w:p>
+      <w:r/>
+      <w:r>
+        <w:rPr>
+          <w:i/>
+        </w:rPr>
+        <w:t>(% and conditions to validate with management.)</w:t>
+      </w:r>
+      <w:r/>
+    </w:p>
+    <w:p>
+      <w:r>
+        <w:rPr>
+          <w:color w:val="CCCCCC"/>
+        </w:rPr>
+        <w:t>__________________________________________________</w:t>
+      </w:r>
+    </w:p>
+    <w:p>
+      <w:pPr>
+        <w:pStyle w:val="Heading1"/>
+      </w:pPr>
+      <w:r>
+        <w:t>🗓️ The 4 weekly themes</w:t>
       </w:r>
     </w:p>
     <w:p>
       <w:r>
-        <w:t>*(% et conditions à valider avec la direction.)*</w:t>
+        <w:t>Week   •   Theme   •   Angle / emotion   •   Products featured</w:t>
+      </w:r>
+    </w:p>
+    <w:p>
+      <w:r>
+        <w:t>1 (29 Jun–5 Jul)   •   **The solid toiletry bag** ✈️   •   "Fits in a pouch, nothing leaks, passes airport security"   •   Solid shampoos, charcoal soap, natural deodorant, beech toothbrush</w:t>
+      </w:r>
+    </w:p>
+    <w:p>
+      <w:r>
+        <w:t>2 (6–12 Jul)   •   **Zero waste camping &amp; hiking** ⛺   •   "Leave nothing but footprints"   •   Water bottles, lunch boxes, nomad cutlery, cake vaisselle + pierre d'argile, charcoal water stick, muscle balm</w:t>
+      </w:r>
+    </w:p>
+    <w:p>
+      <w:r>
+        <w:t>3 (13–19 Jul)   •   **Lakeside &amp; picnic** 🏞️   •   Swiss slow summer, plastic-free picnic   •   Lunch boxes, washable paper towels, bottles, Le Détacheur (stain remover)</w:t>
+      </w:r>
+    </w:p>
+    <w:p>
+      <w:r>
+        <w:t>4 (20–26 Jul)   •   **Sun &amp; after-sun, naturally** ☀️   •   Care for your skin AND the nature you enjoy   •   HARMONY body care, repairing mask, gentle soaps</w:t>
+      </w:r>
+    </w:p>
+    <w:p>
+      <w:r>
+        <w:t>+ 27 Jul–2 Aug   •   **World Nature Conservation Day (28)**   •   Protect what we enjoy in summer   •   Brand values, transition into August</w:t>
+      </w:r>
+    </w:p>
+    <w:p>
+      <w:r/>
+      <w:r>
+        <w:rPr>
+          <w:b/>
+        </w:rPr>
+        <w:t>Cadence:</w:t>
+      </w:r>
+      <w:r>
+        <w:t xml:space="preserve"> 2 posts + 2 stories/week (IG + FB) · 1 LinkedIn B2B post/week · 2 blog articles · 1 client newsletter (4 sends) · 1 reseller newsletter.</w:t>
       </w:r>
     </w:p>
     <w:p>
@@ -174,65 +245,7 @@
         <w:pStyle w:val="Heading1"/>
       </w:pPr>
       <w:r>
-        <w:t>🗓️ Les 4 thèmes hebdomadaires</w:t>
-      </w:r>
-    </w:p>
-    <w:p>
-      <w:r>
-        <w:t>Semaine   •   Thème   •   Angle / émotion   •   Produits mis en avant</w:t>
-      </w:r>
-    </w:p>
-    <w:p>
-      <w:r>
-        <w:t>1 (29 juin–5 juil.)   •   **La trousse de toilette solide** ✈️   •   « Tout tient dans une pochette, rien ne coule, ça passe en cabine »   •   Shampoings solides, savon charbon actif, déodorant naturel, brosse à dents hêtre</w:t>
-      </w:r>
-    </w:p>
-    <w:p>
-      <w:r>
-        <w:t>2 (6–12 juil.)   •   **Zéro déchet en camping &amp; rando** ⛺   •   « Ne laisser que l'empreinte de ses pas »   •   Gourdes, boîtes repas, couverts nomades, cake vaisselle + pierre d'argile, bâton de charbon actif, baume musculaire</w:t>
-      </w:r>
-    </w:p>
-    <w:p>
-      <w:r>
-        <w:t>3 (13–19 juil.)   •   **Au bord du lac &amp; pique-nique** 🏞️   •   Slow summer suisse, pique-nique sans plastique   •   Boîtes repas, essuie-tout lavables, gourdes, Le Détacheur</w:t>
-      </w:r>
-    </w:p>
-    <w:p>
-      <w:r>
-        <w:t>4 (20–26 juil.)   •   **Soleil &amp; après-soleil naturel** ☀️   •   Prendre soin de sa peau ET de la nature   •   Soins corps HARMONY, masque réparateur, savons doux</w:t>
-      </w:r>
-    </w:p>
-    <w:p>
-      <w:r>
-        <w:t>+ 27 juil.–2 août   •   **Journée mondiale de la conservation de la nature (28)**   •   Protéger ce dont on profite l'été   •   Valeurs de marque, transition vers août</w:t>
-      </w:r>
-    </w:p>
-    <w:p>
-      <w:r/>
-      <w:r>
-        <w:rPr>
-          <w:b/>
-        </w:rPr>
-        <w:t>Cadence :</w:t>
-      </w:r>
-      <w:r>
-        <w:t xml:space="preserve"> 2 posts + 2 stories / semaine (IG + FB) · 1 post LinkedIn B2B / semaine · 2 articles de blog · 1 newsletter clients (4 envois) · 1 newsletter revendeurs.</w:t>
-      </w:r>
-    </w:p>
-    <w:p>
-      <w:r>
-        <w:rPr>
-          <w:color w:val="CCCCCC"/>
-        </w:rPr>
-        <w:t>__________________________________________________</w:t>
-      </w:r>
-    </w:p>
-    <w:p>
-      <w:pPr>
-        <w:pStyle w:val="Heading1"/>
-      </w:pPr>
-      <w:r>
-        <w:t>SEMAINE 1 — La trousse de toilette solide ✈️</w:t>
+        <w:t>WEEK 1 — The solid toiletry bag ✈️</w:t>
       </w:r>
     </w:p>
     <w:p>
@@ -242,15 +255,35 @@
           <w:color w:val="4E7A51"/>
           <w:sz w:val="26"/>
         </w:rPr>
-        <w:t>📸 Post 1 — Lancement Kit Voyage</w:t>
+        <w:t>📸 Post 1 — Travel Kit launch</w:t>
       </w:r>
+    </w:p>
+    <w:p>
+      <w:r/>
+      <w:r>
+        <w:rPr>
+          <w:i/>
+        </w:rPr>
+        <w:t>(EN: your toiletry bag, solid version — nothing leaks, everything passes airport security; intro the Travel Kit offer.)</w:t>
+      </w:r>
+      <w:r/>
+    </w:p>
+    <w:p>
+      <w:r/>
+      <w:r>
+        <w:rPr>
+          <w:b/>
+        </w:rPr>
+        <w:t>Caption (FR):</w:t>
+      </w:r>
+      <w:r/>
     </w:p>
     <w:p>
       <w:pPr>
         <w:pStyle w:val="IntenseQuote"/>
       </w:pPr>
       <w:r>
-        <w:t>**Votre trousse de toilette, version solide ✈️🌿**</w:t>
+        <w:t>Votre trousse de toilette, version solide ✈️🌿</w:t>
       </w:r>
     </w:p>
     <w:p>
@@ -263,7 +296,7 @@
         <w:pStyle w:val="IntenseQuote"/>
       </w:pPr>
       <w:r>
-        <w:t>Cet été, on voyage léger : plus de flacons qui coulent, plus de casse-tête à l'aéroport. Shampoing solide, savon, déodorant naturel… **tout passe en cabine, rien ne fuit** 🧳</w:t>
+        <w:t>Cet été, on voyage léger : plus de flacons qui coulent, plus de casse-tête à l'aéroport. Shampoing solide, savon, déodorant naturel… tout passe en cabine, rien ne fuit 🧳</w:t>
       </w:r>
     </w:p>
     <w:p>
@@ -276,7 +309,7 @@
         <w:pStyle w:val="IntenseQuote"/>
       </w:pPr>
       <w:r>
-        <w:t>🎁 Découvrez notre **Kit Voyage** à prix doux pour partir l'esprit (et la valise) léger.</w:t>
+        <w:t>🎁 Découvrez notre Kit Voyage à prix doux pour partir l'esprit (et la valise) léger.</w:t>
       </w:r>
     </w:p>
     <w:p>
@@ -325,15 +358,35 @@
           <w:color w:val="4E7A51"/>
           <w:sz w:val="26"/>
         </w:rPr>
-        <w:t>📸 Post 2 — L'argument avion</w:t>
+        <w:t>📸 Post 2 — The airport-security argument</w:t>
       </w:r>
+    </w:p>
+    <w:p>
+      <w:r/>
+      <w:r>
+        <w:rPr>
+          <w:i/>
+        </w:rPr>
+        <w:t>(EN: no more stress at security — solid = 0 ml of liquid; one bar = up to 3 bottles; soap for body+face+hands; natural deodorant.)</w:t>
+      </w:r>
+      <w:r/>
+    </w:p>
+    <w:p>
+      <w:r/>
+      <w:r>
+        <w:rPr>
+          <w:b/>
+        </w:rPr>
+        <w:t>Caption (FR):</w:t>
+      </w:r>
+      <w:r/>
     </w:p>
     <w:p>
       <w:pPr>
         <w:pStyle w:val="IntenseQuote"/>
       </w:pPr>
       <w:r>
-        <w:t>**Le secret pour ne plus jamais stresser au contrôle de sécurité 🛂✈️**</w:t>
+        <w:t>Le secret pour ne plus jamais stresser au contrôle de sécurité 🛂✈️</w:t>
       </w:r>
     </w:p>
     <w:p>
@@ -346,7 +399,7 @@
         <w:pStyle w:val="IntenseQuote"/>
       </w:pPr>
       <w:r>
-        <w:t>Les liquides en cabine, c'est 100 ml max et le petit sachet transparent… Avec le **solide**, ce problème n'existe plus 🙌</w:t>
+        <w:t>Les liquides en cabine, c'est 100 ml max et le petit sachet transparent… Avec le solide, ce problème n'existe plus 🙌</w:t>
       </w:r>
     </w:p>
     <w:p>
@@ -424,7 +477,7 @@
           <w:color w:val="4E7A51"/>
           <w:sz w:val="26"/>
         </w:rPr>
-        <w:t>📲 Stories S1</w:t>
+        <w:t>📲 Stories Week 1</w:t>
       </w:r>
     </w:p>
     <w:p>
@@ -432,7 +485,7 @@
         <w:pStyle w:val="ListBullet"/>
       </w:pPr>
       <w:r>
-        <w:t>**Story 1 (sondage) :** « Ce qui coule TOUJOURS dans ta valise ? » `Le gel douche 😩` / `Le shampoing 😩` → slide 2 : « La solution → le solide. Swipe 👆 » + lien.</w:t>
+        <w:t>**Story 1 (poll):** on-screen FR *« Ce qui coule TOUJOURS dans ta valise ? »* with options *« Le gel douche 😩 » / « Le shampoing 😩 »*. *(EN: "What always leaks in your suitcase?" → next slide: "The fix → going solid.")*</w:t>
       </w:r>
     </w:p>
     <w:p>
@@ -440,7 +493,7 @@
         <w:pStyle w:val="ListBullet"/>
       </w:pPr>
       <w:r>
-        <w:t>**Story 2 (astuce) :** « ✈️ Le saviez-vous ? Un shampoing solide passe en cabine sans limite de liquide. » + sticker lien Kit Voyage.</w:t>
+        <w:t>**Story 2 (tip):** FR *« ✈️ Le saviez-vous ? Un shampoing solide passe en cabine sans limite de liquide. »* + link sticker to the Travel Kit. *(EN: "Did you know? A solid shampoo passes airport security with no liquid limit.")*</w:t>
       </w:r>
     </w:p>
     <w:p>
@@ -456,7 +509,7 @@
         <w:pStyle w:val="Heading1"/>
       </w:pPr>
       <w:r>
-        <w:t>SEMAINE 2 — Zéro déchet en camping &amp; rando ⛺ (📝 Blog #1)</w:t>
+        <w:t>WEEK 2 — Zero waste camping &amp; hiking ⛺ (📝 Blog #1)</w:t>
       </w:r>
     </w:p>
     <w:p>
@@ -466,15 +519,35 @@
           <w:color w:val="4E7A51"/>
           <w:sz w:val="26"/>
         </w:rPr>
-        <w:t>📸 Post 1 — La checklist camping zéro déchet</w:t>
+        <w:t>📸 Post 1 — Zero-waste camping checklist</w:t>
       </w:r>
+    </w:p>
+    <w:p>
+      <w:r/>
+      <w:r>
+        <w:rPr>
+          <w:i/>
+        </w:rPr>
+        <w:t>(EN: respect nature when you camp; checklist = insulated bottle + charcoal water stick, lunch boxes + cutlery, cake vaisselle + pierre d'argile for dishes, muscle balm for tired legs.)</w:t>
+      </w:r>
+      <w:r/>
+    </w:p>
+    <w:p>
+      <w:r/>
+      <w:r>
+        <w:rPr>
+          <w:b/>
+        </w:rPr>
+        <w:t>Caption (FR):</w:t>
+      </w:r>
+      <w:r/>
     </w:p>
     <w:p>
       <w:pPr>
         <w:pStyle w:val="IntenseQuote"/>
       </w:pPr>
       <w:r>
-        <w:t>**Le camping zéro déchet : notre checklist ⛺🌿**</w:t>
+        <w:t>Le camping zéro déchet : notre checklist ⛺🌿</w:t>
       </w:r>
     </w:p>
     <w:p>
@@ -511,7 +584,7 @@
         <w:pStyle w:val="IntenseQuote"/>
       </w:pPr>
       <w:r>
-        <w:t>🧽 **Cake vaisselle + pierre d'argile** pour la vaisselle au campement</w:t>
+        <w:t>🧽 Cake vaisselle + pierre d'argile pour la vaisselle au campement</w:t>
       </w:r>
     </w:p>
     <w:p>
@@ -568,15 +641,35 @@
           <w:color w:val="4E7A51"/>
           <w:sz w:val="26"/>
         </w:rPr>
-        <w:t>📸 Post 2 — Sortie blog</w:t>
+        <w:t>📸 Post 2 — Blog release</w:t>
       </w:r>
+    </w:p>
+    <w:p>
+      <w:r/>
+      <w:r>
+        <w:rPr>
+          <w:i/>
+        </w:rPr>
+        <w:t>(EN: announce the new blog article "How to stay zero waste hiking &amp; travelling.")</w:t>
+      </w:r>
+      <w:r/>
+    </w:p>
+    <w:p>
+      <w:r/>
+      <w:r>
+        <w:rPr>
+          <w:b/>
+        </w:rPr>
+        <w:t>Caption (FR):</w:t>
+      </w:r>
+      <w:r/>
     </w:p>
     <w:p>
       <w:pPr>
         <w:pStyle w:val="IntenseQuote"/>
       </w:pPr>
       <w:r>
-        <w:t>**Comment rester zéro déchet en randonnée et en voyage 🥾**</w:t>
+        <w:t>Comment rester zéro déchet en randonnée et en voyage 🥾</w:t>
       </w:r>
     </w:p>
     <w:p>
@@ -602,7 +695,7 @@
         <w:pStyle w:val="IntenseQuote"/>
       </w:pPr>
       <w:r>
-        <w:t>📖 À lire sur le blog (lien dans la bio / sur le site).</w:t>
+        <w:t>📖 À lire sur le blog (lien sur le site).</w:t>
       </w:r>
     </w:p>
     <w:p>
@@ -625,7 +718,7 @@
           <w:color w:val="4E7A51"/>
           <w:sz w:val="26"/>
         </w:rPr>
-        <w:t>📲 Stories S2</w:t>
+        <w:t>📲 Stories Week 2</w:t>
       </w:r>
     </w:p>
     <w:p>
@@ -633,7 +726,7 @@
         <w:pStyle w:val="ListBullet"/>
       </w:pPr>
       <w:r>
-        <w:t>**Story 1 (coulisses) :** « On prépare notre sac rando ⛰️ » + produits.</w:t>
+        <w:t>**Story 1 (behind the scenes):** FR *« On prépare notre sac rando ⛰️ »* + products. *(EN: "Packing our hiking bag.")*</w:t>
       </w:r>
     </w:p>
     <w:p>
@@ -641,7 +734,7 @@
         <w:pStyle w:val="ListBullet"/>
       </w:pPr>
       <w:r>
-        <w:t>**Story 2 (quiz) :** « Vrai/Faux : on peut faire la vaisselle au camping sans plastique » → Vrai ✅ cake vaisselle + pierre d'argile.</w:t>
+        <w:t>**Story 2 (quiz):** FR *« Vrai/Faux : on peut faire la vaisselle au camping sans plastique »* → answer Vrai ✅. *(EN: "True/False: you can wash dishes while camping without plastic" → True, with cake vaisselle + pierre d'argile.)*</w:t>
       </w:r>
     </w:p>
     <w:p>
@@ -657,7 +750,7 @@
         <w:pStyle w:val="Heading1"/>
       </w:pPr>
       <w:r>
-        <w:t>SEMAINE 3 — Au bord du lac &amp; pique-nique 🏞️ (⚡ FLASH 1=2 shampoing 15–17 juil.)</w:t>
+        <w:t>WEEK 3 — Lakeside &amp; picnic 🏞️ (⚡ FLASH 1=2 shampoo 15–17 Jul)</w:t>
       </w:r>
     </w:p>
     <w:p>
@@ -667,15 +760,35 @@
           <w:color w:val="4E7A51"/>
           <w:sz w:val="26"/>
         </w:rPr>
-        <w:t>📸 Post 1 — Pique-nique au lac</w:t>
+        <w:t>📸 Post 1 — Lakeside picnic</w:t>
       </w:r>
+    </w:p>
+    <w:p>
+      <w:r/>
+      <w:r>
+        <w:rPr>
+          <w:i/>
+        </w:rPr>
+        <w:t>(EN: the perfect plastic-free lakeside picnic — lunch boxes, bottles, washable towels; Le Détacheur for grass/wine stains.)</w:t>
+      </w:r>
+      <w:r/>
+    </w:p>
+    <w:p>
+      <w:r/>
+      <w:r>
+        <w:rPr>
+          <w:b/>
+        </w:rPr>
+        <w:t>Caption (FR):</w:t>
+      </w:r>
+      <w:r/>
     </w:p>
     <w:p>
       <w:pPr>
         <w:pStyle w:val="IntenseQuote"/>
       </w:pPr>
       <w:r>
-        <w:t>**Le pique-nique parfait au bord du lac 🏞️🧺**</w:t>
+        <w:t>Le pique-nique parfait au bord du lac 🏞️🧺</w:t>
       </w:r>
     </w:p>
     <w:p>
@@ -737,15 +850,35 @@
           <w:color w:val="4E7A51"/>
           <w:sz w:val="26"/>
         </w:rPr>
-        <w:t>📸 Post 2 — FLASH 1 = 2 shampoing</w:t>
+        <w:t>📸 Post 2 — FLASH 1 = 2 shampoo</w:t>
       </w:r>
+    </w:p>
+    <w:p>
+      <w:r/>
+      <w:r>
+        <w:rPr>
+          <w:i/>
+        </w:rPr>
+        <w:t>(EN: 72h flash, second solid shampoo free; great to stock up before holidays; passes security, one bar = 3 bottles, gentle on scalp; ends [date].)</w:t>
+      </w:r>
+      <w:r/>
+    </w:p>
+    <w:p>
+      <w:r/>
+      <w:r>
+        <w:rPr>
+          <w:b/>
+        </w:rPr>
+        <w:t>Caption (FR):</w:t>
+      </w:r>
+      <w:r/>
     </w:p>
     <w:p>
       <w:pPr>
         <w:pStyle w:val="IntenseQuote"/>
       </w:pPr>
       <w:r>
-        <w:t>**⚡ FLASH 72H : 1 = 2 sur nos shampoings solides !**</w:t>
+        <w:t>⚡ FLASH 72H : 1 = 2 sur nos shampoings solides !</w:t>
       </w:r>
     </w:p>
     <w:p>
@@ -807,7 +940,7 @@
           <w:color w:val="4E7A51"/>
           <w:sz w:val="26"/>
         </w:rPr>
-        <w:t>📲 Stories S3</w:t>
+        <w:t>📲 Stories Week 3</w:t>
       </w:r>
     </w:p>
     <w:p>
@@ -815,7 +948,7 @@
         <w:pStyle w:val="ListBullet"/>
       </w:pPr>
       <w:r>
-        <w:t>**Story 1 :** compte à rebours FLASH (J-1) + sticker rappel.</w:t>
+        <w:t>**Story 1:** FLASH countdown (J-1) + reminder sticker. *(EN: countdown to the flash sale.)*</w:t>
       </w:r>
     </w:p>
     <w:p>
@@ -823,7 +956,7 @@
         <w:pStyle w:val="ListBullet"/>
       </w:pPr>
       <w:r>
-        <w:t>**Story 2 :** « Dernières heures du 1=2 ⏳ » + lien.</w:t>
+        <w:t>**Story 2:** FR *« Dernières heures du 1=2 ⏳ »* + link. *(EN: "Final hours of the 1=2 offer.")*</w:t>
       </w:r>
     </w:p>
     <w:p>
@@ -839,7 +972,7 @@
         <w:pStyle w:val="Heading1"/>
       </w:pPr>
       <w:r>
-        <w:t>SEMAINE 4 — Soleil &amp; après-soleil naturel ☀️ (📝 Blog #2)</w:t>
+        <w:t>WEEK 4 — Sun &amp; after-sun, naturally ☀️ (📝 Blog #2)</w:t>
       </w:r>
     </w:p>
     <w:p>
@@ -849,15 +982,35 @@
           <w:color w:val="4E7A51"/>
           <w:sz w:val="26"/>
         </w:rPr>
-        <w:t>📸 Post 1 — Routine après-soleil</w:t>
+        <w:t>📸 Post 1 — After-sun routine</w:t>
       </w:r>
+    </w:p>
+    <w:p>
+      <w:r/>
+      <w:r>
+        <w:rPr>
+          <w:i/>
+        </w:rPr>
+        <w:t>(EN: pamper skin after a sunny day — cleanse with a gentle soap, hydrate, apply repairing mask; natural, plastic-free.)</w:t>
+      </w:r>
+      <w:r/>
+    </w:p>
+    <w:p>
+      <w:r/>
+      <w:r>
+        <w:rPr>
+          <w:b/>
+        </w:rPr>
+        <w:t>Caption (FR):</w:t>
+      </w:r>
+      <w:r/>
     </w:p>
     <w:p>
       <w:pPr>
         <w:pStyle w:val="IntenseQuote"/>
       </w:pPr>
       <w:r>
-        <w:t>**Après le soleil, on chouchoute sa peau ☀️🌿**</w:t>
+        <w:t>Après le soleil, on chouchoute sa peau ☀️🌿</w:t>
       </w:r>
     </w:p>
     <w:p>
@@ -919,15 +1072,35 @@
           <w:color w:val="4E7A51"/>
           <w:sz w:val="26"/>
         </w:rPr>
-        <w:t>📸 Post 2 — Sortie blog</w:t>
+        <w:t>📸 Post 2 — Blog release</w:t>
       </w:r>
+    </w:p>
+    <w:p>
+      <w:r/>
+      <w:r>
+        <w:rPr>
+          <w:i/>
+        </w:rPr>
+        <w:t>(EN: announce the summer skincare blog article — prepare, hydrate, repair.)</w:t>
+      </w:r>
+      <w:r/>
+    </w:p>
+    <w:p>
+      <w:r/>
+      <w:r>
+        <w:rPr>
+          <w:b/>
+        </w:rPr>
+        <w:t>Caption (FR):</w:t>
+      </w:r>
+      <w:r/>
     </w:p>
     <w:p>
       <w:pPr>
         <w:pStyle w:val="IntenseQuote"/>
       </w:pPr>
       <w:r>
-        <w:t>**Votre routine beauté d'été, version naturelle 🌞**</w:t>
+        <w:t>Votre routine beauté d'été, version naturelle 🌞</w:t>
       </w:r>
     </w:p>
     <w:p>
@@ -976,7 +1149,7 @@
           <w:color w:val="4E7A51"/>
           <w:sz w:val="26"/>
         </w:rPr>
-        <w:t>📲 Stories S4</w:t>
+        <w:t>📲 Stories Week 4</w:t>
       </w:r>
     </w:p>
     <w:p>
@@ -984,7 +1157,7 @@
         <w:pStyle w:val="ListBullet"/>
       </w:pPr>
       <w:r>
-        <w:t>**Story 1 (sondage) :** « Ta priorité l'été ? » `Hydratation 💧` / `Apaiser après-soleil 🧖`</w:t>
+        <w:t>**Story 1 (poll):** FR *« Ta priorité l'été ? »* options *« Hydratation 💧 » / « Apaiser après-soleil 🧖 »*. *(EN: "Your summer priority? Hydration / soothing after-sun.")*</w:t>
       </w:r>
     </w:p>
     <w:p>
@@ -992,7 +1165,7 @@
         <w:pStyle w:val="ListBullet"/>
       </w:pPr>
       <w:r>
-        <w:t>**Story 2 (produit) :** spotlight masque réparateur + lien.</w:t>
+        <w:t>**Story 2 (product):** repairing mask spotlight + link. *(EN: product spotlight.)*</w:t>
       </w:r>
     </w:p>
     <w:p>
@@ -1008,7 +1181,7 @@
         <w:pStyle w:val="Heading1"/>
       </w:pPr>
       <w:r>
-        <w:t>🌍 27 juil.–2 août — Journée mondiale de la conservation de la nature (28)</w:t>
+        <w:t>🌍 27 Jul–2 Aug — World Nature Conservation Day (28)</w:t>
       </w:r>
     </w:p>
     <w:p>
@@ -1018,15 +1191,35 @@
           <w:color w:val="4E7A51"/>
           <w:sz w:val="26"/>
         </w:rPr>
-        <w:t>📸 Post — Valeurs</w:t>
+        <w:t>📸 Post — Brand values</w:t>
       </w:r>
+    </w:p>
+    <w:p>
+      <w:r/>
+      <w:r>
+        <w:rPr>
+          <w:i/>
+        </w:rPr>
+        <w:t>(EN: we enjoy Swiss lakes/forests/mountains in summer, so let's protect them; every natural, local, zero-waste product is a small step; ask for their best nature memory.)</w:t>
+      </w:r>
+      <w:r/>
+    </w:p>
+    <w:p>
+      <w:r/>
+      <w:r>
+        <w:rPr>
+          <w:b/>
+        </w:rPr>
+        <w:t>Caption (FR):</w:t>
+      </w:r>
+      <w:r/>
     </w:p>
     <w:p>
       <w:pPr>
         <w:pStyle w:val="IntenseQuote"/>
       </w:pPr>
       <w:r>
-        <w:t>**28 juillet — Journée mondiale de la conservation de la nature 🌍**</w:t>
+        <w:t>28 juillet — Journée mondiale de la conservation de la nature 🌍</w:t>
       </w:r>
     </w:p>
     <w:p>
@@ -1081,7 +1274,7 @@
         <w:pStyle w:val="Heading1"/>
       </w:pPr>
       <w:r>
-        <w:t>✍️ Articles de blog (2)</w:t>
+        <w:t>✍️ Blog articles (2)</w:t>
       </w:r>
     </w:p>
     <w:p>
@@ -1092,10 +1285,19 @@
         <w:rPr>
           <w:b/>
         </w:rPr>
-        <w:t>Comment rester zéro déchet en randonnée et en voyage</w:t>
+        <w:t>"How to stay zero waste hiking &amp; travelling"</w:t>
       </w:r>
       <w:r>
-        <w:t xml:space="preserve"> — mot-clé : *voyage zéro déchet* — gourdes, vaisselle nomade, bâton de charbon, soins solides.</w:t>
+        <w:t xml:space="preserve"> — keyword: </w:t>
+      </w:r>
+      <w:r>
+        <w:rPr>
+          <w:i/>
+        </w:rPr>
+        <w:t>voyage zéro déchet</w:t>
+      </w:r>
+      <w:r>
+        <w:t xml:space="preserve"> — bottles, nomad dishwashing, water filtration, solid care.</w:t>
       </w:r>
     </w:p>
     <w:p>
@@ -1106,18 +1308,19 @@
         <w:rPr>
           <w:b/>
         </w:rPr>
-        <w:t>Cosmétiques solides &amp; voyage : tout passe en cabine</w:t>
+        <w:t>"Solid cosmetics &amp; travel: everything passes airport security"</w:t>
       </w:r>
       <w:r>
-        <w:t xml:space="preserve"> — mot-clé : *shampoing solide avion / cosmétique solide voyage* — l'argument liquides + guide de la trousse solide.</w:t>
+        <w:t xml:space="preserve"> — keyword: </w:t>
       </w:r>
-    </w:p>
-    <w:p>
       <w:r>
         <w:rPr>
-          <w:color w:val="CCCCCC"/>
+          <w:i/>
         </w:rPr>
-        <w:t>__________________________________________________</w:t>
+        <w:t>shampoing solide avion / cosmétique solide voyage</w:t>
+      </w:r>
+      <w:r>
+        <w:t xml:space="preserve"> — the liquids argument + solid-kit guide.</w:t>
       </w:r>
     </w:p>
     <w:p>
@@ -1125,7 +1328,7 @@
         <w:pStyle w:val="Heading1"/>
       </w:pPr>
       <w:r>
-        <w:t>✉️ Newsletter clients — JUILLET (1 offre, 4 envois)</w:t>
+        <w:t>✉️ Client newsletter — JULY (1 offer, 4 sends, Thursdays)</w:t>
       </w:r>
     </w:p>
     <w:p>
@@ -1134,7 +1337,7 @@
         <w:rPr>
           <w:b/>
         </w:rPr>
-        <w:t>Thème : Kit Voyage zéro déchet · envois hebdo (jeudi)</w:t>
+        <w:t>Theme: Travel Kit zero waste</w:t>
       </w:r>
       <w:r/>
     </w:p>
@@ -1146,10 +1349,19 @@
         <w:rPr>
           <w:b/>
         </w:rPr>
-        <w:t>Lancement :</w:t>
+        <w:t>Launch:</w:t>
       </w:r>
       <w:r>
-        <w:t xml:space="preserve"> « Vos vacances, version sans plastique ✈️🌱 » — présentation du Kit Voyage.</w:t>
+        <w:t xml:space="preserve"> subject FR </w:t>
+      </w:r>
+      <w:r>
+        <w:rPr>
+          <w:i/>
+        </w:rPr>
+        <w:t>« Vos vacances, version sans plastique ✈️🌱 »</w:t>
+      </w:r>
+      <w:r>
+        <w:t xml:space="preserve"> — present the Travel Kit.</w:t>
       </w:r>
     </w:p>
     <w:p>
@@ -1160,10 +1372,19 @@
         <w:rPr>
           <w:b/>
         </w:rPr>
-        <w:t>Valeur + blog :</w:t>
+        <w:t>Value + blog:</w:t>
       </w:r>
       <w:r>
-        <w:t xml:space="preserve"> « Le secret pour ne plus stresser à l'aéroport » — argument liquides + lien blog.</w:t>
+        <w:t xml:space="preserve"> FR </w:t>
+      </w:r>
+      <w:r>
+        <w:rPr>
+          <w:i/>
+        </w:rPr>
+        <w:t>« Le secret pour ne plus stresser à l'aéroport »</w:t>
+      </w:r>
+      <w:r>
+        <w:t xml:space="preserve"> — liquids argument + blog link.</w:t>
       </w:r>
     </w:p>
     <w:p>
@@ -1174,10 +1395,19 @@
         <w:rPr>
           <w:b/>
         </w:rPr>
-        <w:t>Preuve sociale / FLASH :</w:t>
+        <w:t>Flash:</w:t>
       </w:r>
       <w:r>
-        <w:t xml:space="preserve"> « ⚡ 1 = 2 sur les shampoings solides » — annonce du flash.</w:t>
+        <w:t xml:space="preserve"> FR </w:t>
+      </w:r>
+      <w:r>
+        <w:rPr>
+          <w:i/>
+        </w:rPr>
+        <w:t>« ⚡ 1 = 2 sur les shampoings solides »</w:t>
+      </w:r>
+      <w:r>
+        <w:t xml:space="preserve"> — announce the flash.</w:t>
       </w:r>
     </w:p>
     <w:p>
@@ -1188,10 +1418,19 @@
         <w:rPr>
           <w:b/>
         </w:rPr>
-        <w:t>Dernière chance :</w:t>
+        <w:t>Last chance:</w:t>
       </w:r>
       <w:r>
-        <w:t xml:space="preserve"> « Derniers jours pour préparer votre été zéro déchet ».</w:t>
+        <w:t xml:space="preserve"> FR </w:t>
+      </w:r>
+      <w:r>
+        <w:rPr>
+          <w:i/>
+        </w:rPr>
+        <w:t>« Derniers jours pour préparer votre été zéro déchet »</w:t>
+      </w:r>
+      <w:r>
+        <w:t>.</w:t>
       </w:r>
     </w:p>
     <w:p>
@@ -1199,7 +1438,7 @@
         <w:pStyle w:val="Heading1"/>
       </w:pPr>
       <w:r>
-        <w:t>✉️ Newsletter revendeurs — JUILLET</w:t>
+        <w:t>✉️ Reseller newsletter — JULY</w:t>
       </w:r>
     </w:p>
     <w:p>
@@ -1207,7 +1446,7 @@
         <w:pStyle w:val="ListBullet"/>
       </w:pPr>
       <w:r>
-        <w:t>**Objet :** [B2B] Rayon « voyage » : les solides best-sellers de l'été + vos prix de gros</w:t>
+        <w:t>Subject FR: *[B2B] Rayon « voyage » : les solides best-sellers de l'été + vos prix de gros*</w:t>
       </w:r>
     </w:p>
     <w:p>
@@ -1215,7 +1454,7 @@
         <w:pStyle w:val="ListBullet"/>
       </w:pPr>
       <w:r>
-        <w:t>Focus : assortiment shampoings/savons solides, déodorants ; argument « passe en cabine » à relayer en boutique ; conditions de gros.</w:t>
+        <w:t>Focus: solid shampoos/soaps + deodorants assortment; the "passes airport security" argument to relay in store; wholesale terms.</w:t>
       </w:r>
     </w:p>
     <w:p>
@@ -1223,35 +1462,27 @@
         <w:pStyle w:val="Heading1"/>
       </w:pPr>
       <w:r>
-        <w:t>💼 LinkedIn B2B — JUILLET (1/semaine)</w:t>
+        <w:t>💼 LinkedIn B2B — JULY (1/week)</w:t>
       </w:r>
     </w:p>
     <w:p>
       <w:r>
-        <w:t>1. Préparez vos rayons « voyage/vacances » : assortiment solides recommandé.</w:t>
+        <w:t>1. Stock your "travel/holiday" shelf: recommended solids assortment.</w:t>
       </w:r>
     </w:p>
     <w:p>
       <w:r>
-        <w:t>2. Marges &amp; rotation : pourquoi les solides performent en boutique l'été.</w:t>
+        <w:t>2. Margins &amp; turnover: why solids perform in store in summer.</w:t>
       </w:r>
     </w:p>
     <w:p>
       <w:r>
-        <w:t>3. Le baume musculaire, best-seller — argumentaire pour pharmacies/spas.</w:t>
+        <w:t>3. The muscle balm best-seller — sales pitch for pharmacies/spas.</w:t>
       </w:r>
     </w:p>
     <w:p>
       <w:r>
-        <w:t>4. Conservation de la nature : co-communiquer nos valeurs avec vos clients.</w:t>
-      </w:r>
-    </w:p>
-    <w:p>
-      <w:r>
-        <w:rPr>
-          <w:color w:val="CCCCCC"/>
-        </w:rPr>
-        <w:t>__________________________________________________</w:t>
+        <w:t>4. Nature Conservation Day: co-communicate our values with your customers.</w:t>
       </w:r>
     </w:p>
     <w:p>
@@ -1259,7 +1490,7 @@
         <w:pStyle w:val="Heading1"/>
       </w:pPr>
       <w:r>
-        <w:t>🎬 Idées Reels (portée maximale)</w:t>
+        <w:t>🎬 Reel ideas (max reach)</w:t>
       </w:r>
     </w:p>
     <w:p>
@@ -1267,7 +1498,7 @@
         <w:pStyle w:val="ListBullet"/>
       </w:pPr>
       <w:r>
-        <w:t>**Packing POV :** déposer ses produits solides dans une pochette vs. un flacon qui fuit 🫠 (relatable).</w:t>
+        <w:t>**Packing POV:** dropping solid products into a pouch vs. a leaking bottle 🫠 (relatable).</w:t>
       </w:r>
     </w:p>
     <w:p>
@@ -1275,7 +1506,7 @@
         <w:pStyle w:val="ListBullet"/>
       </w:pPr>
       <w:r>
-        <w:t>**Vaisselle au camping :** cake vaisselle + pierre d'argile au bord du lac.</w:t>
+        <w:t>**Dishes while camping:** cake vaisselle + pierre d'argile by the lake.</w:t>
       </w:r>
     </w:p>
     <w:p>
@@ -1283,7 +1514,7 @@
         <w:pStyle w:val="ListBullet"/>
       </w:pPr>
       <w:r>
-        <w:t>**Aéroport :** « POV : tu passes la sécurité sans sortir tes liquides » ✈️.</w:t>
+        <w:t>**Airport:** "POV: you breeze through security without pulling out your liquids" ✈️.</w:t>
       </w:r>
     </w:p>
     <w:p>
@@ -1291,7 +1522,7 @@
         <w:pStyle w:val="Heading1"/>
       </w:pPr>
       <w:r>
-        <w:t>🏷️ Hashtags du mois</w:t>
+        <w:t>🏷️ Hashtags of the month</w:t>
       </w:r>
     </w:p>
     <w:p>
@@ -1304,7 +1535,7 @@
         <w:pStyle w:val="Heading1"/>
       </w:pPr>
       <w:r>
-        <w:t>✅ À confirmer</w:t>
+        <w:t>✅ To confirm</w:t>
       </w:r>
     </w:p>
     <w:p>
@@ -1312,7 +1543,7 @@
         <w:pStyle w:val="ListBullet"/>
       </w:pPr>
       <w:r>
-        <w:t>% exact du Kit Voyage et conditions du flash 1=2 (dates précises).</w:t>
+        <w:t>Exact Travel Kit % and flash 1=2 conditions (precise dates).</w:t>
       </w:r>
     </w:p>
     <w:p>
@@ -1320,7 +1551,7 @@
         <w:pStyle w:val="ListBullet"/>
       </w:pPr>
       <w:r>
-        <w:t>Visuels : privilégier lac/montagne suisse, lifestyle authentique.</w:t>
+        <w:t>Visuals: favour Swiss lake/mountain, authentic lifestyle.</w:t>
       </w:r>
     </w:p>
     <w:p>
@@ -1328,7 +1559,7 @@
         <w:pStyle w:val="ListBullet"/>
       </w:pPr>
       <w:r>
-        <w:t>Adapter en DE les posts à forte portée + les newsletters.</w:t>
+        <w:t>Adapt high-reach posts + newsletters into German (Suisse alémanique).</w:t>
       </w:r>
     </w:p>
     <w:sectPr>

</xml_diff>